<commit_message>
feat: Update Adaptive Snapshot Cleanup Implementation Guide and add ST-08 script
- Revised the Implementation Guide for Adaptive Snapshot Cleanup to clarify prerequisites, configuration steps, and workflow details.
- Enhanced documentation with clearer instructions on vCenter privileges, action modules, and workflow attributes.
- Introduced new script ST-08_ReleaseMutexAndFinalise.js to handle mutex release and finalization of the workflow, ensuring proper logging and summary reporting.
- Improved error handling and logging mechanisms throughout the workflow.
</commit_message>
<xml_diff>
--- a/OrchestratorWorkflows/vCenter/vms/snapshots/Documentation/01_Executive_Summary.docx
+++ b/OrchestratorWorkflows/vCenter/vms/snapshots/Documentation/01_Executive_Summary.docx
@@ -84,29 +84,7 @@
           <w:sz w:val="20"/>
           <w:szCs w:val="20"/>
         </w:rPr>
-        <w:t xml:space="preserve">TECHNICAL </w:t>
-      </w:r>
-      <w:proofErr w:type="gramStart"/>
-      <w:r>
-        <w:rPr>
-          <w:b/>
-          <w:bCs/>
-          <w:color w:val="5BA3E8"/>
-          <w:sz w:val="20"/>
-          <w:szCs w:val="20"/>
-        </w:rPr>
-        <w:t>ADVISORY  ·</w:t>
-      </w:r>
-      <w:proofErr w:type="gramEnd"/>
-      <w:r>
-        <w:rPr>
-          <w:b/>
-          <w:bCs/>
-          <w:color w:val="5BA3E8"/>
-          <w:sz w:val="20"/>
-          <w:szCs w:val="20"/>
-        </w:rPr>
-        <w:t xml:space="preserve">  PRIVATE CLOUD OPERATIONS</w:t>
+        <w:t>TECHNICAL ADVISORY  ·  PRIVATE CLOUD OPERATIONS</w:t>
       </w:r>
     </w:p>
     <w:p>
@@ -209,18 +187,7 @@
           <w:sz w:val="18"/>
           <w:szCs w:val="18"/>
         </w:rPr>
-        <w:t>AUDIENCE</w:t>
-      </w:r>
-      <w:proofErr w:type="gramStart"/>
-      <w:r>
-        <w:rPr>
-          <w:b/>
-          <w:bCs/>
-          <w:color w:val="404040"/>
-          <w:sz w:val="18"/>
-          <w:szCs w:val="18"/>
-        </w:rPr>
-        <w:t xml:space="preserve">:  </w:t>
+        <w:t xml:space="preserve">AUDIENCE:  </w:t>
       </w:r>
       <w:r>
         <w:rPr>
@@ -228,16 +195,7 @@
           <w:sz w:val="18"/>
           <w:szCs w:val="18"/>
         </w:rPr>
-        <w:t>Department</w:t>
-      </w:r>
-      <w:proofErr w:type="gramEnd"/>
-      <w:r>
-        <w:rPr>
-          <w:color w:val="707070"/>
-          <w:sz w:val="18"/>
-          <w:szCs w:val="18"/>
-        </w:rPr>
-        <w:t xml:space="preserve"> of State, DT/EI/IM/CVS, IT Leadership, Infrastructure Management</w:t>
+        <w:t>Department of State, DT/EI/IM/CVS, IT Leadership, Infrastructure Management</w:t>
       </w:r>
     </w:p>
     <w:p>
@@ -259,7 +217,13 @@
         <w:spacing w:after="120"/>
       </w:pPr>
       <w:r>
-        <w:t>Adaptive Snapshot Cleanup is a scheduled vRealize Orchestrator workflow that automatically removes aged virtual machine snapshots across every vCenter registered in the environment. Unlike a simple cron-style cleanup, the workflow continuously samples live storage performance and throttles its own activity in response, so it never causes the latency spikes that operators traditionally fear when consolidating large or stale snapshot chains during business hours.</w:t>
+        <w:t xml:space="preserve">Adaptive Snapshot Cleanup is a scheduled </w:t>
+      </w:r>
+      <w:r>
+        <w:t>VCF</w:t>
+      </w:r>
+      <w:r>
+        <w:t xml:space="preserve"> Orchestrator workflow that automatically removes aged virtual machine snapshots across every vCenter registered in the environment. Unlike a simple cron-style cleanup, the workflow continuously samples live storage performance and throttles its own activity in response, so it never causes the latency spikes that operators traditionally fear when consolidating large or stale snapshot chains during business hours.</w:t>
       </w:r>
     </w:p>
     <w:p>
@@ -300,12 +264,6 @@
         <w:gridCol w:w="6960"/>
       </w:tblGrid>
       <w:tr>
-        <w:tblPrEx>
-          <w:tblCellMar>
-            <w:top w:w="0" w:type="dxa"/>
-            <w:bottom w:w="0" w:type="dxa"/>
-          </w:tblCellMar>
-        </w:tblPrEx>
         <w:trPr>
           <w:tblHeader/>
         </w:trPr>
@@ -371,12 +329,6 @@
         </w:tc>
       </w:tr>
       <w:tr>
-        <w:tblPrEx>
-          <w:tblCellMar>
-            <w:top w:w="0" w:type="dxa"/>
-            <w:bottom w:w="0" w:type="dxa"/>
-          </w:tblCellMar>
-        </w:tblPrEx>
         <w:tc>
           <w:tcPr>
             <w:tcW w:w="2400" w:type="dxa"/>
@@ -439,12 +391,6 @@
         </w:tc>
       </w:tr>
       <w:tr>
-        <w:tblPrEx>
-          <w:tblCellMar>
-            <w:top w:w="0" w:type="dxa"/>
-            <w:bottom w:w="0" w:type="dxa"/>
-          </w:tblCellMar>
-        </w:tblPrEx>
         <w:tc>
           <w:tcPr>
             <w:tcW w:w="2400" w:type="dxa"/>
@@ -507,12 +453,6 @@
         </w:tc>
       </w:tr>
       <w:tr>
-        <w:tblPrEx>
-          <w:tblCellMar>
-            <w:top w:w="0" w:type="dxa"/>
-            <w:bottom w:w="0" w:type="dxa"/>
-          </w:tblCellMar>
-        </w:tblPrEx>
         <w:tc>
           <w:tcPr>
             <w:tcW w:w="2400" w:type="dxa"/>
@@ -575,12 +515,6 @@
         </w:tc>
       </w:tr>
       <w:tr>
-        <w:tblPrEx>
-          <w:tblCellMar>
-            <w:top w:w="0" w:type="dxa"/>
-            <w:bottom w:w="0" w:type="dxa"/>
-          </w:tblCellMar>
-        </w:tblPrEx>
         <w:tc>
           <w:tcPr>
             <w:tcW w:w="2400" w:type="dxa"/>
@@ -643,12 +577,6 @@
         </w:tc>
       </w:tr>
       <w:tr>
-        <w:tblPrEx>
-          <w:tblCellMar>
-            <w:top w:w="0" w:type="dxa"/>
-            <w:bottom w:w="0" w:type="dxa"/>
-          </w:tblCellMar>
-        </w:tblPrEx>
         <w:tc>
           <w:tcPr>
             <w:tcW w:w="2400" w:type="dxa"/>
@@ -711,12 +639,6 @@
         </w:tc>
       </w:tr>
       <w:tr>
-        <w:tblPrEx>
-          <w:tblCellMar>
-            <w:top w:w="0" w:type="dxa"/>
-            <w:bottom w:w="0" w:type="dxa"/>
-          </w:tblCellMar>
-        </w:tblPrEx>
         <w:tc>
           <w:tcPr>
             <w:tcW w:w="2400" w:type="dxa"/>
@@ -800,7 +722,13 @@
         <w:spacing w:after="120"/>
       </w:pPr>
       <w:r>
-        <w:t>On its scheduled interval the workflow executes a nine-stage pipeline. Each stage has a single responsibility, and each stage logs its outcome with a consistent marker so the entire run can be filtered to a single line of search in Aria Operations for Logs.</w:t>
+        <w:t xml:space="preserve">On its scheduled interval the workflow executes a </w:t>
+      </w:r>
+      <w:r>
+        <w:t>six</w:t>
+      </w:r>
+      <w:r>
+        <w:t>-stage pipeline. Each stage has a single responsibility, and each stage logs its outcome with a consistent marker so the entire run can be filtered to a single line of search in Aria Operations for Logs.</w:t>
       </w:r>
     </w:p>
     <w:tbl>
@@ -825,12 +753,6 @@
         <w:gridCol w:w="7960"/>
       </w:tblGrid>
       <w:tr>
-        <w:tblPrEx>
-          <w:tblCellMar>
-            <w:top w:w="0" w:type="dxa"/>
-            <w:bottom w:w="0" w:type="dxa"/>
-          </w:tblCellMar>
-        </w:tblPrEx>
         <w:trPr>
           <w:tblHeader/>
         </w:trPr>
@@ -896,12 +818,6 @@
         </w:tc>
       </w:tr>
       <w:tr>
-        <w:tblPrEx>
-          <w:tblCellMar>
-            <w:top w:w="0" w:type="dxa"/>
-            <w:bottom w:w="0" w:type="dxa"/>
-          </w:tblCellMar>
-        </w:tblPrEx>
         <w:tc>
           <w:tcPr>
             <w:tcW w:w="1400" w:type="dxa"/>
@@ -964,12 +880,6 @@
         </w:tc>
       </w:tr>
       <w:tr>
-        <w:tblPrEx>
-          <w:tblCellMar>
-            <w:top w:w="0" w:type="dxa"/>
-            <w:bottom w:w="0" w:type="dxa"/>
-          </w:tblCellMar>
-        </w:tblPrEx>
         <w:tc>
           <w:tcPr>
             <w:tcW w:w="1400" w:type="dxa"/>
@@ -1032,12 +942,6 @@
         </w:tc>
       </w:tr>
       <w:tr>
-        <w:tblPrEx>
-          <w:tblCellMar>
-            <w:top w:w="0" w:type="dxa"/>
-            <w:bottom w:w="0" w:type="dxa"/>
-          </w:tblCellMar>
-        </w:tblPrEx>
         <w:tc>
           <w:tcPr>
             <w:tcW w:w="1400" w:type="dxa"/>
@@ -1101,12 +1005,6 @@
         </w:tc>
       </w:tr>
       <w:tr>
-        <w:tblPrEx>
-          <w:tblCellMar>
-            <w:top w:w="0" w:type="dxa"/>
-            <w:bottom w:w="0" w:type="dxa"/>
-          </w:tblCellMar>
-        </w:tblPrEx>
         <w:tc>
           <w:tcPr>
             <w:tcW w:w="1400" w:type="dxa"/>
@@ -1169,12 +1067,6 @@
         </w:tc>
       </w:tr>
       <w:tr>
-        <w:tblPrEx>
-          <w:tblCellMar>
-            <w:top w:w="0" w:type="dxa"/>
-            <w:bottom w:w="0" w:type="dxa"/>
-          </w:tblCellMar>
-        </w:tblPrEx>
         <w:tc>
           <w:tcPr>
             <w:tcW w:w="1400" w:type="dxa"/>
@@ -1237,12 +1129,6 @@
         </w:tc>
       </w:tr>
       <w:tr>
-        <w:tblPrEx>
-          <w:tblCellMar>
-            <w:top w:w="0" w:type="dxa"/>
-            <w:bottom w:w="0" w:type="dxa"/>
-          </w:tblCellMar>
-        </w:tblPrEx>
         <w:tc>
           <w:tcPr>
             <w:tcW w:w="1400" w:type="dxa"/>
@@ -1335,12 +1221,6 @@
         <w:gridCol w:w="9240"/>
       </w:tblGrid>
       <w:tr>
-        <w:tblPrEx>
-          <w:tblCellMar>
-            <w:top w:w="0" w:type="dxa"/>
-            <w:bottom w:w="0" w:type="dxa"/>
-          </w:tblCellMar>
-        </w:tblPrEx>
         <w:tc>
           <w:tcPr>
             <w:tcW w:w="120" w:type="dxa"/>
@@ -1383,7 +1263,13 @@
           </w:p>
           <w:p>
             <w:r>
-              <w:t>Out of the box the workflow does not delete anything. It simulates the run, logs every snapshot it would have removed, and exits cleanly. Live mode is a single input flag that operators set deliberately, with full audit trail.</w:t>
+              <w:t>Dry Run mode</w:t>
+            </w:r>
+            <w:r>
+              <w:t xml:space="preserve"> simulates the run, logs every snapshot it would have removed, and exits cleanly</w:t>
+            </w:r>
+            <w:r>
+              <w:t xml:space="preserve"> without making any changes to the environment.</w:t>
             </w:r>
           </w:p>
         </w:tc>
@@ -1402,7 +1288,13 @@
         <w:spacing w:after="120"/>
       </w:pPr>
       <w:r>
-        <w:t>The workflow is owned by the Infrastructure Operations team and runs on the embedded vRealize Orchestrator instance inside VCF. There are three operating roles:</w:t>
+        <w:t xml:space="preserve">The workflow is owned by the Infrastructure Operations team and runs on the embedded </w:t>
+      </w:r>
+      <w:r>
+        <w:t>VCF</w:t>
+      </w:r>
+      <w:r>
+        <w:t xml:space="preserve"> Orchestrator instance inside VCF. There are three operating roles:</w:t>
       </w:r>
     </w:p>
     <w:tbl>
@@ -1427,12 +1319,6 @@
         <w:gridCol w:w="6960"/>
       </w:tblGrid>
       <w:tr>
-        <w:tblPrEx>
-          <w:tblCellMar>
-            <w:top w:w="0" w:type="dxa"/>
-            <w:bottom w:w="0" w:type="dxa"/>
-          </w:tblCellMar>
-        </w:tblPrEx>
         <w:trPr>
           <w:tblHeader/>
         </w:trPr>
@@ -1498,12 +1384,6 @@
         </w:tc>
       </w:tr>
       <w:tr>
-        <w:tblPrEx>
-          <w:tblCellMar>
-            <w:top w:w="0" w:type="dxa"/>
-            <w:bottom w:w="0" w:type="dxa"/>
-          </w:tblCellMar>
-        </w:tblPrEx>
         <w:tc>
           <w:tcPr>
             <w:tcW w:w="2400" w:type="dxa"/>
@@ -1560,18 +1440,19 @@
                 <w:sz w:val="20"/>
                 <w:szCs w:val="20"/>
               </w:rPr>
-              <w:t>vRO administrator. Maintains the workflow, manages the schedule, reviews defaults, and approves changes to thresholds.</w:t>
+              <w:t>VCF Orchestrator</w:t>
+            </w:r>
+            <w:r>
+              <w:rPr>
+                <w:sz w:val="20"/>
+                <w:szCs w:val="20"/>
+              </w:rPr>
+              <w:t xml:space="preserve"> administrator. Maintains the workflow, manages the schedule, reviews defaults, and approves changes to thresholds.</w:t>
             </w:r>
           </w:p>
         </w:tc>
       </w:tr>
       <w:tr>
-        <w:tblPrEx>
-          <w:tblCellMar>
-            <w:top w:w="0" w:type="dxa"/>
-            <w:bottom w:w="0" w:type="dxa"/>
-          </w:tblCellMar>
-        </w:tblPrEx>
         <w:tc>
           <w:tcPr>
             <w:tcW w:w="2400" w:type="dxa"/>
@@ -1634,12 +1515,6 @@
         </w:tc>
       </w:tr>
       <w:tr>
-        <w:tblPrEx>
-          <w:tblCellMar>
-            <w:top w:w="0" w:type="dxa"/>
-            <w:bottom w:w="0" w:type="dxa"/>
-          </w:tblCellMar>
-        </w:tblPrEx>
         <w:tc>
           <w:tcPr>
             <w:tcW w:w="2400" w:type="dxa"/>
@@ -1741,12 +1616,6 @@
         <w:gridCol w:w="2160"/>
       </w:tblGrid>
       <w:tr>
-        <w:tblPrEx>
-          <w:tblCellMar>
-            <w:top w:w="0" w:type="dxa"/>
-            <w:bottom w:w="0" w:type="dxa"/>
-          </w:tblCellMar>
-        </w:tblPrEx>
         <w:trPr>
           <w:tblHeader/>
         </w:trPr>
@@ -1842,12 +1711,6 @@
         </w:tc>
       </w:tr>
       <w:tr>
-        <w:tblPrEx>
-          <w:tblCellMar>
-            <w:top w:w="0" w:type="dxa"/>
-            <w:bottom w:w="0" w:type="dxa"/>
-          </w:tblCellMar>
-        </w:tblPrEx>
         <w:tc>
           <w:tcPr>
             <w:tcW w:w="2400" w:type="dxa"/>
@@ -1940,12 +1803,6 @@
         </w:tc>
       </w:tr>
       <w:tr>
-        <w:tblPrEx>
-          <w:tblCellMar>
-            <w:top w:w="0" w:type="dxa"/>
-            <w:bottom w:w="0" w:type="dxa"/>
-          </w:tblCellMar>
-        </w:tblPrEx>
         <w:tc>
           <w:tcPr>
             <w:tcW w:w="2400" w:type="dxa"/>
@@ -1972,7 +1829,6 @@
                 <w:sz w:val="20"/>
                 <w:szCs w:val="20"/>
               </w:rPr>
-              <w:lastRenderedPageBreak/>
               <w:t>Two runs collide and corrupt state</w:t>
             </w:r>
           </w:p>
@@ -2039,12 +1895,6 @@
         </w:tc>
       </w:tr>
       <w:tr>
-        <w:tblPrEx>
-          <w:tblCellMar>
-            <w:top w:w="0" w:type="dxa"/>
-            <w:bottom w:w="0" w:type="dxa"/>
-          </w:tblCellMar>
-        </w:tblPrEx>
         <w:tc>
           <w:tcPr>
             <w:tcW w:w="2400" w:type="dxa"/>
@@ -2071,23 +1921,8 @@
                 <w:sz w:val="20"/>
                 <w:szCs w:val="20"/>
               </w:rPr>
-              <w:t xml:space="preserve">Snapshot needed by a backup or </w:t>
-            </w:r>
-            <w:proofErr w:type="gramStart"/>
-            <w:r>
-              <w:rPr>
-                <w:sz w:val="20"/>
-                <w:szCs w:val="20"/>
-              </w:rPr>
-              <w:t>restore</w:t>
-            </w:r>
-            <w:proofErr w:type="gramEnd"/>
-            <w:r>
-              <w:rPr>
-                <w:sz w:val="20"/>
-                <w:szCs w:val="20"/>
-              </w:rPr>
-              <w:t xml:space="preserve"> is removed</w:t>
+              <w:lastRenderedPageBreak/>
+              <w:t>Snapshot needed by a backup or restore is removed</w:t>
             </w:r>
           </w:p>
         </w:tc>
@@ -2117,7 +1952,21 @@
                 <w:sz w:val="20"/>
                 <w:szCs w:val="20"/>
               </w:rPr>
-              <w:t>Multi-value description-ignore filter (descIgnoreStrings array); safety check skips any VM with an active backup, clone, snapshot, or migration task. Templates are never modified.</w:t>
+              <w:t xml:space="preserve">Multi-value description-ignore filter (descIgnoreStrings array); safety check skips any VM </w:t>
+            </w:r>
+            <w:r>
+              <w:rPr>
+                <w:sz w:val="20"/>
+                <w:szCs w:val="20"/>
+              </w:rPr>
+              <w:t>snapshot with a description containing a matching value</w:t>
+            </w:r>
+            <w:r>
+              <w:rPr>
+                <w:sz w:val="20"/>
+                <w:szCs w:val="20"/>
+              </w:rPr>
+              <w:t>. Templates are never modified.</w:t>
             </w:r>
           </w:p>
         </w:tc>
@@ -2153,12 +2002,6 @@
         </w:tc>
       </w:tr>
       <w:tr>
-        <w:tblPrEx>
-          <w:tblCellMar>
-            <w:top w:w="0" w:type="dxa"/>
-            <w:bottom w:w="0" w:type="dxa"/>
-          </w:tblCellMar>
-        </w:tblPrEx>
         <w:tc>
           <w:tcPr>
             <w:tcW w:w="2400" w:type="dxa"/>
@@ -2251,12 +2094,6 @@
         </w:tc>
       </w:tr>
       <w:tr>
-        <w:tblPrEx>
-          <w:tblCellMar>
-            <w:top w:w="0" w:type="dxa"/>
-            <w:bottom w:w="0" w:type="dxa"/>
-          </w:tblCellMar>
-        </w:tblPrEx>
         <w:tc>
           <w:tcPr>
             <w:tcW w:w="2400" w:type="dxa"/>
@@ -2370,7 +2207,19 @@
         <w:spacing w:after="120"/>
       </w:pPr>
       <w:r>
-        <w:t xml:space="preserve">Each run emits a structured summary that is queryable in Aria Operations for Logs by the marker </w:t>
+        <w:t xml:space="preserve">Each run emits a structured summary that is </w:t>
+      </w:r>
+      <w:r>
+        <w:t>able to be queried</w:t>
+      </w:r>
+      <w:r>
+        <w:t xml:space="preserve"> in </w:t>
+      </w:r>
+      <w:r>
+        <w:t>VCF</w:t>
+      </w:r>
+      <w:r>
+        <w:t xml:space="preserve"> Operations for Logs by the marker </w:t>
       </w:r>
       <w:r>
         <w:rPr>
@@ -2394,23 +2243,7 @@
         <w:spacing w:after="80"/>
       </w:pPr>
       <w:r>
-        <w:t xml:space="preserve">Run ID and outcome (Success, Dry Run Complete, Completed </w:t>
-      </w:r>
-      <w:proofErr w:type="gramStart"/>
-      <w:r>
-        <w:t>With</w:t>
-      </w:r>
-      <w:proofErr w:type="gramEnd"/>
-      <w:r>
-        <w:t xml:space="preserve"> Deferrals, Completed </w:t>
-      </w:r>
-      <w:proofErr w:type="gramStart"/>
-      <w:r>
-        <w:t>With</w:t>
-      </w:r>
-      <w:proofErr w:type="gramEnd"/>
-      <w:r>
-        <w:t xml:space="preserve"> Errors)</w:t>
+        <w:t>Run ID and outcome (Success, Dry Run Complete, Completed With Deferrals, Completed With Errors)</w:t>
       </w:r>
     </w:p>
     <w:p>
@@ -2423,15 +2256,7 @@
         <w:spacing w:after="80"/>
       </w:pPr>
       <w:r>
-        <w:t xml:space="preserve">Counts of snapshots deleted, </w:t>
-      </w:r>
-      <w:proofErr w:type="gramStart"/>
-      <w:r>
-        <w:t>dry-run</w:t>
-      </w:r>
-      <w:proofErr w:type="gramEnd"/>
-      <w:r>
-        <w:t>, skipped, deferred, and failed</w:t>
+        <w:t>Counts of snapshots deleted, dry-run, skipped, deferred, and failed</w:t>
       </w:r>
     </w:p>
     <w:p>
@@ -2486,15 +2311,7 @@
         <w:spacing w:after="120"/>
       </w:pPr>
       <w:r>
-        <w:t xml:space="preserve">This output is suitable for a daily </w:t>
-      </w:r>
-      <w:proofErr w:type="gramStart"/>
-      <w:r>
-        <w:t>ops</w:t>
-      </w:r>
-      <w:proofErr w:type="gramEnd"/>
-      <w:r>
-        <w:t xml:space="preserve"> dashboard or a weekly capacity report. No separate database or reporting infrastructure is needed.</w:t>
+        <w:t>This output is suitable for a daily ops dashboard or a weekly capacity report. No separate database or reporting infrastructure is needed.</w:t>
       </w:r>
     </w:p>
     <w:p>
@@ -2528,12 +2345,6 @@
         <w:gridCol w:w="1560"/>
       </w:tblGrid>
       <w:tr>
-        <w:tblPrEx>
-          <w:tblCellMar>
-            <w:top w:w="0" w:type="dxa"/>
-            <w:bottom w:w="0" w:type="dxa"/>
-          </w:tblCellMar>
-        </w:tblPrEx>
         <w:trPr>
           <w:tblHeader/>
         </w:trPr>
@@ -2629,12 +2440,6 @@
         </w:tc>
       </w:tr>
       <w:tr>
-        <w:tblPrEx>
-          <w:tblCellMar>
-            <w:top w:w="0" w:type="dxa"/>
-            <w:bottom w:w="0" w:type="dxa"/>
-          </w:tblCellMar>
-        </w:tblPrEx>
         <w:tc>
           <w:tcPr>
             <w:tcW w:w="800" w:type="dxa"/>
@@ -2727,12 +2532,6 @@
         </w:tc>
       </w:tr>
       <w:tr>
-        <w:tblPrEx>
-          <w:tblCellMar>
-            <w:top w:w="0" w:type="dxa"/>
-            <w:bottom w:w="0" w:type="dxa"/>
-          </w:tblCellMar>
-        </w:tblPrEx>
         <w:tc>
           <w:tcPr>
             <w:tcW w:w="800" w:type="dxa"/>
@@ -2825,12 +2624,6 @@
         </w:tc>
       </w:tr>
       <w:tr>
-        <w:tblPrEx>
-          <w:tblCellMar>
-            <w:top w:w="0" w:type="dxa"/>
-            <w:bottom w:w="0" w:type="dxa"/>
-          </w:tblCellMar>
-        </w:tblPrEx>
         <w:tc>
           <w:tcPr>
             <w:tcW w:w="800" w:type="dxa"/>
@@ -2918,17 +2711,18 @@
                 <w:szCs w:val="20"/>
               </w:rPr>
               <w:t>Backup Ops</w:t>
+            </w:r>
+            <w:r>
+              <w:rPr>
+                <w:sz w:val="20"/>
+                <w:szCs w:val="20"/>
+              </w:rPr>
+              <w:t>, Infra Ops</w:t>
             </w:r>
           </w:p>
         </w:tc>
       </w:tr>
       <w:tr>
-        <w:tblPrEx>
-          <w:tblCellMar>
-            <w:top w:w="0" w:type="dxa"/>
-            <w:bottom w:w="0" w:type="dxa"/>
-          </w:tblCellMar>
-        </w:tblPrEx>
         <w:tc>
           <w:tcPr>
             <w:tcW w:w="800" w:type="dxa"/>
@@ -2955,7 +2749,6 @@
                 <w:sz w:val="20"/>
                 <w:szCs w:val="20"/>
               </w:rPr>
-              <w:lastRenderedPageBreak/>
               <w:t>4</w:t>
             </w:r>
           </w:p>
@@ -3022,12 +2815,6 @@
         </w:tc>
       </w:tr>
       <w:tr>
-        <w:tblPrEx>
-          <w:tblCellMar>
-            <w:top w:w="0" w:type="dxa"/>
-            <w:bottom w:w="0" w:type="dxa"/>
-          </w:tblCellMar>
-        </w:tblPrEx>
         <w:tc>
           <w:tcPr>
             <w:tcW w:w="800" w:type="dxa"/>
@@ -3125,6 +2912,7 @@
         <w:spacing w:after="60"/>
       </w:pPr>
       <w:r>
+        <w:lastRenderedPageBreak/>
         <w:t xml:space="preserve"> </w:t>
       </w:r>
     </w:p>
@@ -3158,12 +2946,6 @@
         <w:gridCol w:w="6960"/>
       </w:tblGrid>
       <w:tr>
-        <w:tblPrEx>
-          <w:tblCellMar>
-            <w:top w:w="0" w:type="dxa"/>
-            <w:bottom w:w="0" w:type="dxa"/>
-          </w:tblCellMar>
-        </w:tblPrEx>
         <w:trPr>
           <w:tblHeader/>
         </w:trPr>
@@ -3229,12 +3011,6 @@
         </w:tc>
       </w:tr>
       <w:tr>
-        <w:tblPrEx>
-          <w:tblCellMar>
-            <w:top w:w="0" w:type="dxa"/>
-            <w:bottom w:w="0" w:type="dxa"/>
-          </w:tblCellMar>
-        </w:tblPrEx>
         <w:tc>
           <w:tcPr>
             <w:tcW w:w="2400" w:type="dxa"/>
@@ -3297,12 +3073,6 @@
         </w:tc>
       </w:tr>
       <w:tr>
-        <w:tblPrEx>
-          <w:tblCellMar>
-            <w:top w:w="0" w:type="dxa"/>
-            <w:bottom w:w="0" w:type="dxa"/>
-          </w:tblCellMar>
-        </w:tblPrEx>
         <w:tc>
           <w:tcPr>
             <w:tcW w:w="2400" w:type="dxa"/>
@@ -3359,34 +3129,12 @@
                 <w:sz w:val="20"/>
                 <w:szCs w:val="20"/>
               </w:rPr>
-              <w:t xml:space="preserve">The process of merging a snapshot back into the live disk. This is what “deleting a snapshot” </w:t>
-            </w:r>
-            <w:proofErr w:type="gramStart"/>
-            <w:r>
-              <w:rPr>
-                <w:sz w:val="20"/>
-                <w:szCs w:val="20"/>
-              </w:rPr>
-              <w:t>actually does</w:t>
-            </w:r>
-            <w:proofErr w:type="gramEnd"/>
-            <w:r>
-              <w:rPr>
-                <w:sz w:val="20"/>
-                <w:szCs w:val="20"/>
-              </w:rPr>
-              <w:t>, and it generates storage I/O proportional to how much the disk has changed since the snapshot was taken.</w:t>
+              <w:t>The process of merging a snapshot back into the live disk. This is what “deleting a snapshot” actually does, and it generates storage I/O proportional to how much the disk has changed since the snapshot was taken.</w:t>
             </w:r>
           </w:p>
         </w:tc>
       </w:tr>
       <w:tr>
-        <w:tblPrEx>
-          <w:tblCellMar>
-            <w:top w:w="0" w:type="dxa"/>
-            <w:bottom w:w="0" w:type="dxa"/>
-          </w:tblCellMar>
-        </w:tblPrEx>
         <w:tc>
           <w:tcPr>
             <w:tcW w:w="2400" w:type="dxa"/>
@@ -3449,12 +3197,6 @@
         </w:tc>
       </w:tr>
       <w:tr>
-        <w:tblPrEx>
-          <w:tblCellMar>
-            <w:top w:w="0" w:type="dxa"/>
-            <w:bottom w:w="0" w:type="dxa"/>
-          </w:tblCellMar>
-        </w:tblPrEx>
         <w:tc>
           <w:tcPr>
             <w:tcW w:w="2400" w:type="dxa"/>
@@ -3511,34 +3253,12 @@
                 <w:sz w:val="20"/>
                 <w:szCs w:val="20"/>
               </w:rPr>
-              <w:t xml:space="preserve">VMware’s management </w:t>
-            </w:r>
-            <w:proofErr w:type="gramStart"/>
-            <w:r>
-              <w:rPr>
-                <w:sz w:val="20"/>
-                <w:szCs w:val="20"/>
-              </w:rPr>
-              <w:t>plane</w:t>
-            </w:r>
-            <w:proofErr w:type="gramEnd"/>
-            <w:r>
-              <w:rPr>
-                <w:sz w:val="20"/>
-                <w:szCs w:val="20"/>
-              </w:rPr>
-              <w:t xml:space="preserve"> for a group of ESXi hosts and the VMs running on them. Most environments have several.</w:t>
+              <w:t>VMware’s management plane for a group of ESXi hosts and the VMs running on them. Most environments have several.</w:t>
             </w:r>
           </w:p>
         </w:tc>
       </w:tr>
       <w:tr>
-        <w:tblPrEx>
-          <w:tblCellMar>
-            <w:top w:w="0" w:type="dxa"/>
-            <w:bottom w:w="0" w:type="dxa"/>
-          </w:tblCellMar>
-        </w:tblPrEx>
         <w:tc>
           <w:tcPr>
             <w:tcW w:w="2400" w:type="dxa"/>
@@ -3565,7 +3285,14 @@
                 <w:sz w:val="20"/>
                 <w:szCs w:val="20"/>
               </w:rPr>
-              <w:t>vRealize Orchestrator (vRO)</w:t>
+              <w:t>VCF</w:t>
+            </w:r>
+            <w:r>
+              <w:rPr>
+                <w:sz w:val="20"/>
+                <w:szCs w:val="20"/>
+              </w:rPr>
+              <w:t xml:space="preserve"> Orchestrator (vRO)</w:t>
             </w:r>
           </w:p>
         </w:tc>
@@ -3601,12 +3328,6 @@
         </w:tc>
       </w:tr>
       <w:tr>
-        <w:tblPrEx>
-          <w:tblCellMar>
-            <w:top w:w="0" w:type="dxa"/>
-            <w:bottom w:w="0" w:type="dxa"/>
-          </w:tblCellMar>
-        </w:tblPrEx>
         <w:tc>
           <w:tcPr>
             <w:tcW w:w="2400" w:type="dxa"/>
@@ -3669,12 +3390,6 @@
         </w:tc>
       </w:tr>
       <w:tr>
-        <w:tblPrEx>
-          <w:tblCellMar>
-            <w:top w:w="0" w:type="dxa"/>
-            <w:bottom w:w="0" w:type="dxa"/>
-          </w:tblCellMar>
-        </w:tblPrEx>
         <w:tc>
           <w:tcPr>
             <w:tcW w:w="2400" w:type="dxa"/>
@@ -3737,12 +3452,6 @@
         </w:tc>
       </w:tr>
       <w:tr>
-        <w:tblPrEx>
-          <w:tblCellMar>
-            <w:top w:w="0" w:type="dxa"/>
-            <w:bottom w:w="0" w:type="dxa"/>
-          </w:tblCellMar>
-        </w:tblPrEx>
         <w:tc>
           <w:tcPr>
             <w:tcW w:w="2400" w:type="dxa"/>
@@ -3805,12 +3514,6 @@
         </w:tc>
       </w:tr>
       <w:tr>
-        <w:tblPrEx>
-          <w:tblCellMar>
-            <w:top w:w="0" w:type="dxa"/>
-            <w:bottom w:w="0" w:type="dxa"/>
-          </w:tblCellMar>
-        </w:tblPrEx>
         <w:tc>
           <w:tcPr>
             <w:tcW w:w="2400" w:type="dxa"/>
@@ -5206,4 +4909,169 @@
     </a:ext>
   </a:extLst>
 </a:theme>
+</file>
+
+<file path=customXml/item1.xml><?xml version="1.0" encoding="utf-8"?>
+<ct:contentTypeSchema xmlns:ct="http://schemas.microsoft.com/office/2006/metadata/contentType" xmlns:ma="http://schemas.microsoft.com/office/2006/metadata/properties/metaAttributes" ct:_="" ma:_="" ma:contentTypeName="Document" ma:contentTypeID="0x010100F31F3E2BDF57D84FBD1940DB5BFE70A1" ma:contentTypeVersion="3" ma:contentTypeDescription="Create a new document." ma:contentTypeScope="" ma:versionID="39fcf3856f7d4bce19b1a7baee24e2fb">
+  <xsd:schema xmlns:xsd="http://www.w3.org/2001/XMLSchema" xmlns:xs="http://www.w3.org/2001/XMLSchema" xmlns:p="http://schemas.microsoft.com/office/2006/metadata/properties" xmlns:ns2="214119f6-a8cf-4ab0-bc74-24d72ad44cda" targetNamespace="http://schemas.microsoft.com/office/2006/metadata/properties" ma:root="true" ma:fieldsID="18390e324b02758fffdb74a4b908be18" ns2:_="">
+    <xsd:import namespace="214119f6-a8cf-4ab0-bc74-24d72ad44cda"/>
+    <xsd:element name="properties">
+      <xsd:complexType>
+        <xsd:sequence>
+          <xsd:element name="documentManagement">
+            <xsd:complexType>
+              <xsd:all>
+                <xsd:element ref="ns2:MediaServiceMetadata" minOccurs="0"/>
+                <xsd:element ref="ns2:MediaServiceFastMetadata" minOccurs="0"/>
+                <xsd:element ref="ns2:MediaServiceSearchProperties" minOccurs="0"/>
+              </xsd:all>
+            </xsd:complexType>
+          </xsd:element>
+        </xsd:sequence>
+      </xsd:complexType>
+    </xsd:element>
+  </xsd:schema>
+  <xsd:schema xmlns:xsd="http://www.w3.org/2001/XMLSchema" xmlns:xs="http://www.w3.org/2001/XMLSchema" xmlns:dms="http://schemas.microsoft.com/office/2006/documentManagement/types" xmlns:pc="http://schemas.microsoft.com/office/infopath/2007/PartnerControls" targetNamespace="214119f6-a8cf-4ab0-bc74-24d72ad44cda" elementFormDefault="qualified">
+    <xsd:import namespace="http://schemas.microsoft.com/office/2006/documentManagement/types"/>
+    <xsd:import namespace="http://schemas.microsoft.com/office/infopath/2007/PartnerControls"/>
+    <xsd:element name="MediaServiceMetadata" ma:index="8" nillable="true" ma:displayName="MediaServiceMetadata" ma:hidden="true" ma:internalName="MediaServiceMetadata" ma:readOnly="true">
+      <xsd:simpleType>
+        <xsd:restriction base="dms:Note"/>
+      </xsd:simpleType>
+    </xsd:element>
+    <xsd:element name="MediaServiceFastMetadata" ma:index="9" nillable="true" ma:displayName="MediaServiceFastMetadata" ma:hidden="true" ma:internalName="MediaServiceFastMetadata" ma:readOnly="true">
+      <xsd:simpleType>
+        <xsd:restriction base="dms:Note"/>
+      </xsd:simpleType>
+    </xsd:element>
+    <xsd:element name="MediaServiceSearchProperties" ma:index="10" nillable="true" ma:displayName="MediaServiceSearchProperties" ma:hidden="true" ma:internalName="MediaServiceSearchProperties" ma:readOnly="true">
+      <xsd:simpleType>
+        <xsd:restriction base="dms:Note"/>
+      </xsd:simpleType>
+    </xsd:element>
+  </xsd:schema>
+  <xsd:schema xmlns="http://schemas.openxmlformats.org/package/2006/metadata/core-properties" xmlns:xsd="http://www.w3.org/2001/XMLSchema" xmlns:xsi="http://www.w3.org/2001/XMLSchema-instance" xmlns:dc="http://purl.org/dc/elements/1.1/" xmlns:dcterms="http://purl.org/dc/terms/" xmlns:odoc="http://schemas.microsoft.com/internal/obd" targetNamespace="http://schemas.openxmlformats.org/package/2006/metadata/core-properties" elementFormDefault="qualified" attributeFormDefault="unqualified" blockDefault="#all">
+    <xsd:import namespace="http://purl.org/dc/elements/1.1/" schemaLocation="http://dublincore.org/schemas/xmls/qdc/2003/04/02/dc.xsd"/>
+    <xsd:import namespace="http://purl.org/dc/terms/" schemaLocation="http://dublincore.org/schemas/xmls/qdc/2003/04/02/dcterms.xsd"/>
+    <xsd:element name="coreProperties" type="CT_coreProperties"/>
+    <xsd:complexType name="CT_coreProperties">
+      <xsd:all>
+        <xsd:element ref="dc:creator" minOccurs="0" maxOccurs="1"/>
+        <xsd:element ref="dcterms:created" minOccurs="0" maxOccurs="1"/>
+        <xsd:element ref="dc:identifier" minOccurs="0" maxOccurs="1"/>
+        <xsd:element name="contentType" minOccurs="0" maxOccurs="1" type="xsd:string" ma:index="0" ma:displayName="Content Type"/>
+        <xsd:element ref="dc:title" minOccurs="0" maxOccurs="1" ma:index="4" ma:displayName="Title"/>
+        <xsd:element ref="dc:subject" minOccurs="0" maxOccurs="1"/>
+        <xsd:element ref="dc:description" minOccurs="0" maxOccurs="1"/>
+        <xsd:element name="keywords" minOccurs="0" maxOccurs="1" type="xsd:string"/>
+        <xsd:element ref="dc:language" minOccurs="0" maxOccurs="1"/>
+        <xsd:element name="category" minOccurs="0" maxOccurs="1" type="xsd:string"/>
+        <xsd:element name="version" minOccurs="0" maxOccurs="1" type="xsd:string"/>
+        <xsd:element name="revision" minOccurs="0" maxOccurs="1" type="xsd:string">
+          <xsd:annotation>
+            <xsd:documentation>
+                        This value indicates the number of saves or revisions. The application is responsible for updating this value after each revision.
+                    </xsd:documentation>
+          </xsd:annotation>
+        </xsd:element>
+        <xsd:element name="lastModifiedBy" minOccurs="0" maxOccurs="1" type="xsd:string"/>
+        <xsd:element ref="dcterms:modified" minOccurs="0" maxOccurs="1"/>
+        <xsd:element name="contentStatus" minOccurs="0" maxOccurs="1" type="xsd:string"/>
+      </xsd:all>
+    </xsd:complexType>
+  </xsd:schema>
+  <xs:schema xmlns:pc="http://schemas.microsoft.com/office/infopath/2007/PartnerControls" xmlns:xs="http://www.w3.org/2001/XMLSchema" targetNamespace="http://schemas.microsoft.com/office/infopath/2007/PartnerControls" elementFormDefault="qualified" attributeFormDefault="unqualified">
+    <xs:element name="Person">
+      <xs:complexType>
+        <xs:sequence>
+          <xs:element ref="pc:DisplayName" minOccurs="0"/>
+          <xs:element ref="pc:AccountId" minOccurs="0"/>
+          <xs:element ref="pc:AccountType" minOccurs="0"/>
+        </xs:sequence>
+      </xs:complexType>
+    </xs:element>
+    <xs:element name="DisplayName" type="xs:string"/>
+    <xs:element name="AccountId" type="xs:string"/>
+    <xs:element name="AccountType" type="xs:string"/>
+    <xs:element name="BDCAssociatedEntity">
+      <xs:complexType>
+        <xs:sequence>
+          <xs:element ref="pc:BDCEntity" minOccurs="0" maxOccurs="unbounded"/>
+        </xs:sequence>
+        <xs:attribute ref="pc:EntityNamespace"/>
+        <xs:attribute ref="pc:EntityName"/>
+        <xs:attribute ref="pc:SystemInstanceName"/>
+        <xs:attribute ref="pc:AssociationName"/>
+      </xs:complexType>
+    </xs:element>
+    <xs:attribute name="EntityNamespace" type="xs:string"/>
+    <xs:attribute name="EntityName" type="xs:string"/>
+    <xs:attribute name="SystemInstanceName" type="xs:string"/>
+    <xs:attribute name="AssociationName" type="xs:string"/>
+    <xs:element name="BDCEntity">
+      <xs:complexType>
+        <xs:sequence>
+          <xs:element ref="pc:EntityDisplayName" minOccurs="0"/>
+          <xs:element ref="pc:EntityInstanceReference" minOccurs="0"/>
+          <xs:element ref="pc:EntityId1" minOccurs="0"/>
+          <xs:element ref="pc:EntityId2" minOccurs="0"/>
+          <xs:element ref="pc:EntityId3" minOccurs="0"/>
+          <xs:element ref="pc:EntityId4" minOccurs="0"/>
+          <xs:element ref="pc:EntityId5" minOccurs="0"/>
+        </xs:sequence>
+      </xs:complexType>
+    </xs:element>
+    <xs:element name="EntityDisplayName" type="xs:string"/>
+    <xs:element name="EntityInstanceReference" type="xs:string"/>
+    <xs:element name="EntityId1" type="xs:string"/>
+    <xs:element name="EntityId2" type="xs:string"/>
+    <xs:element name="EntityId3" type="xs:string"/>
+    <xs:element name="EntityId4" type="xs:string"/>
+    <xs:element name="EntityId5" type="xs:string"/>
+    <xs:element name="Terms">
+      <xs:complexType>
+        <xs:sequence>
+          <xs:element ref="pc:TermInfo" minOccurs="0" maxOccurs="unbounded"/>
+        </xs:sequence>
+      </xs:complexType>
+    </xs:element>
+    <xs:element name="TermInfo">
+      <xs:complexType>
+        <xs:sequence>
+          <xs:element ref="pc:TermName" minOccurs="0"/>
+          <xs:element ref="pc:TermId" minOccurs="0"/>
+        </xs:sequence>
+      </xs:complexType>
+    </xs:element>
+    <xs:element name="TermName" type="xs:string"/>
+    <xs:element name="TermId" type="xs:string"/>
+  </xs:schema>
+</ct:contentTypeSchema>
+</file>
+
+<file path=customXml/item2.xml><?xml version="1.0" encoding="utf-8"?>
+<?mso-contentType ?>
+<FormTemplates xmlns="http://schemas.microsoft.com/sharepoint/v3/contenttype/forms">
+  <Display>DocumentLibraryForm</Display>
+  <Edit>DocumentLibraryForm</Edit>
+  <New>DocumentLibraryForm</New>
+</FormTemplates>
+</file>
+
+<file path=customXml/item3.xml><?xml version="1.0" encoding="utf-8"?>
+<p:properties xmlns:p="http://schemas.microsoft.com/office/2006/metadata/properties" xmlns:xsi="http://www.w3.org/2001/XMLSchema-instance" xmlns:pc="http://schemas.microsoft.com/office/infopath/2007/PartnerControls">
+  <documentManagement/>
+</p:properties>
+</file>
+
+<file path=customXml/itemProps1.xml><?xml version="1.0" encoding="utf-8"?>
+<ds:datastoreItem xmlns:ds="http://schemas.openxmlformats.org/officeDocument/2006/customXml" ds:itemID="{FDF9878D-B723-4284-85BE-6F755F13C5AD}"/>
+</file>
+
+<file path=customXml/itemProps2.xml><?xml version="1.0" encoding="utf-8"?>
+<ds:datastoreItem xmlns:ds="http://schemas.openxmlformats.org/officeDocument/2006/customXml" ds:itemID="{FA6F2FEA-DDC7-413B-B5EB-BC685C8414B0}"/>
+</file>
+
+<file path=customXml/itemProps3.xml><?xml version="1.0" encoding="utf-8"?>
+<ds:datastoreItem xmlns:ds="http://schemas.openxmlformats.org/officeDocument/2006/customXml" ds:itemID="{167F8C84-1551-4EBC-8E34-C5C95108CBA6}"/>
 </file>
</xml_diff>

<commit_message>
Remove outdated documentation files for Adaptive Snapshot Cleanup workflow, including DEPLOYMENT_GUIDE.md, TEST_SIMULATION.md, and VARIABLE_BINDING_REFERENCE.md. These files have been deleted to streamline the documentation and ensure only relevant materials are maintained.
</commit_message>
<xml_diff>
--- a/OrchestratorWorkflows/vCenter/vms/snapshots/Documentation/01_Executive_Summary.docx
+++ b/OrchestratorWorkflows/vCenter/vms/snapshots/Documentation/01_Executive_Summary.docx
@@ -228,7 +228,7 @@
           <w:sz w:val="18"/>
           <w:szCs w:val="18"/>
         </w:rPr>
-        <w:t>Department</w:t>
+        <w:t>&lt;</w:t>
       </w:r>
       <w:proofErr w:type="gramEnd"/>
       <w:r>
@@ -237,7 +237,7 @@
           <w:sz w:val="18"/>
           <w:szCs w:val="18"/>
         </w:rPr>
-        <w:t xml:space="preserve"> of State, DT/EI/IM/CVS, IT Leadership, Infrastructure Management</w:t>
+        <w:t>customer&gt;, &lt;groups&gt;</w:t>
       </w:r>
     </w:p>
     <w:p>
@@ -249,6 +249,7 @@
         <w:jc w:val="center"/>
       </w:pPr>
     </w:p>
+    <w:p/>
     <w:p/>
     <w:p/>
     <w:p/>
@@ -5120,15 +5121,6 @@
 </file>
 
 <file path=customXml/item1.xml><?xml version="1.0" encoding="utf-8"?>
-<?mso-contentType ?>
-<FormTemplates xmlns="http://schemas.microsoft.com/sharepoint/v3/contenttype/forms">
-  <Display>DocumentLibraryForm</Display>
-  <Edit>DocumentLibraryForm</Edit>
-  <New>DocumentLibraryForm</New>
-</FormTemplates>
-</file>
-
-<file path=customXml/item2.xml><?xml version="1.0" encoding="utf-8"?>
 <ct:contentTypeSchema xmlns:ct="http://schemas.microsoft.com/office/2006/metadata/contentType" xmlns:ma="http://schemas.microsoft.com/office/2006/metadata/properties/metaAttributes" ct:_="" ma:_="" ma:contentTypeName="Document" ma:contentTypeID="0x010100F31F3E2BDF57D84FBD1940DB5BFE70A1" ma:contentTypeVersion="3" ma:contentTypeDescription="Create a new document." ma:contentTypeScope="" ma:versionID="39fcf3856f7d4bce19b1a7baee24e2fb">
   <xsd:schema xmlns:xsd="http://www.w3.org/2001/XMLSchema" xmlns:xs="http://www.w3.org/2001/XMLSchema" xmlns:p="http://schemas.microsoft.com/office/2006/metadata/properties" xmlns:ns2="214119f6-a8cf-4ab0-bc74-24d72ad44cda" targetNamespace="http://schemas.microsoft.com/office/2006/metadata/properties" ma:root="true" ma:fieldsID="18390e324b02758fffdb74a4b908be18" ns2:_="">
     <xsd:import namespace="214119f6-a8cf-4ab0-bc74-24d72ad44cda"/>
@@ -5266,6 +5258,15 @@
 </ct:contentTypeSchema>
 </file>
 
+<file path=customXml/item2.xml><?xml version="1.0" encoding="utf-8"?>
+<?mso-contentType ?>
+<FormTemplates xmlns="http://schemas.microsoft.com/sharepoint/v3/contenttype/forms">
+  <Display>DocumentLibraryForm</Display>
+  <Edit>DocumentLibraryForm</Edit>
+  <New>DocumentLibraryForm</New>
+</FormTemplates>
+</file>
+
 <file path=customXml/item3.xml><?xml version="1.0" encoding="utf-8"?>
 <p:properties xmlns:p="http://schemas.microsoft.com/office/2006/metadata/properties" xmlns:xsi="http://www.w3.org/2001/XMLSchema-instance" xmlns:pc="http://schemas.microsoft.com/office/infopath/2007/PartnerControls">
   <documentManagement/>
@@ -5273,14 +5274,6 @@
 </file>
 
 <file path=customXml/itemProps1.xml><?xml version="1.0" encoding="utf-8"?>
-<ds:datastoreItem xmlns:ds="http://schemas.openxmlformats.org/officeDocument/2006/customXml" ds:itemID="{FA6F2FEA-DDC7-413B-B5EB-BC685C8414B0}">
-  <ds:schemaRefs>
-    <ds:schemaRef ds:uri="http://schemas.microsoft.com/sharepoint/v3/contenttype/forms"/>
-  </ds:schemaRefs>
-</ds:datastoreItem>
-</file>
-
-<file path=customXml/itemProps2.xml><?xml version="1.0" encoding="utf-8"?>
 <ds:datastoreItem xmlns:ds="http://schemas.openxmlformats.org/officeDocument/2006/customXml" ds:itemID="{FDF9878D-B723-4284-85BE-6F755F13C5AD}">
   <ds:schemaRefs>
     <ds:schemaRef ds:uri="http://schemas.microsoft.com/office/2006/metadata/contentType"/>
@@ -5298,6 +5291,14 @@
 </ds:datastoreItem>
 </file>
 
+<file path=customXml/itemProps2.xml><?xml version="1.0" encoding="utf-8"?>
+<ds:datastoreItem xmlns:ds="http://schemas.openxmlformats.org/officeDocument/2006/customXml" ds:itemID="{FA6F2FEA-DDC7-413B-B5EB-BC685C8414B0}">
+  <ds:schemaRefs>
+    <ds:schemaRef ds:uri="http://schemas.microsoft.com/sharepoint/v3/contenttype/forms"/>
+  </ds:schemaRefs>
+</ds:datastoreItem>
+</file>
+
 <file path=customXml/itemProps3.xml><?xml version="1.0" encoding="utf-8"?>
 <ds:datastoreItem xmlns:ds="http://schemas.openxmlformats.org/officeDocument/2006/customXml" ds:itemID="{167F8C84-1551-4EBC-8E34-C5C95108CBA6}">
   <ds:schemaRefs>

</xml_diff>